<commit_message>
Added screenshots to chapter 7
</commit_message>
<xml_diff>
--- a/ch7/Scrnshtch07.docx
+++ b/ch7/Scrnshtch07.docx
@@ -2,7 +2,242 @@
 <file path=word/document.xml><?xml version="1.0" encoding="utf-8"?>
 <w:document xmlns:wpc="http://schemas.microsoft.com/office/word/2010/wordprocessingCanvas" xmlns:cx="http://schemas.microsoft.com/office/drawing/2014/chartex" xmlns:cx1="http://schemas.microsoft.com/office/drawing/2015/9/8/chartex" xmlns:cx2="http://schemas.microsoft.com/office/drawing/2015/10/21/chartex" xmlns:cx3="http://schemas.microsoft.com/office/drawing/2016/5/9/chartex" xmlns:cx4="http://schemas.microsoft.com/office/drawing/2016/5/10/chartex" xmlns:cx5="http://schemas.microsoft.com/office/drawing/2016/5/11/chartex" xmlns:cx6="http://schemas.microsoft.com/office/drawing/2016/5/12/chartex" xmlns:cx7="http://schemas.microsoft.com/office/drawing/2016/5/13/chartex" xmlns:cx8="http://schemas.microsoft.com/office/drawing/2016/5/14/chartex" xmlns:mc="http://schemas.openxmlformats.org/markup-compatibility/2006" xmlns:aink="http://schemas.microsoft.com/office/drawing/2016/ink" xmlns:am3d="http://schemas.microsoft.com/office/drawing/2017/model3d" xmlns:o="urn:schemas-microsoft-com:office:office" xmlns:oel="http://schemas.microsoft.com/office/2019/extlst" xmlns:r="http://schemas.openxmlformats.org/officeDocument/2006/relationships" xmlns:m="http://schemas.openxmlformats.org/officeDocument/2006/math" xmlns:v="urn:schemas-microsoft-com:vml" xmlns:wp14="http://schemas.microsoft.com/office/word/2010/wordprocessingDrawing" xmlns:wp="http://schemas.openxmlformats.org/drawingml/2006/wordprocessingDrawing" xmlns:w10="urn:schemas-microsoft-com:office:word" xmlns:w="http://schemas.openxmlformats.org/wordprocessingml/2006/main" xmlns:w14="http://schemas.microsoft.com/office/word/2010/wordml" xmlns:w15="http://schemas.microsoft.com/office/word/2012/wordml" xmlns:w16cex="http://schemas.microsoft.com/office/word/2018/wordml/cex" xmlns:w16cid="http://schemas.microsoft.com/office/word/2016/wordml/cid" xmlns:w16="http://schemas.microsoft.com/office/word/2018/wordml" xmlns:w16du="http://schemas.microsoft.com/office/word/2023/wordml/word16du" xmlns:w16sdtdh="http://schemas.microsoft.com/office/word/2020/wordml/sdtdatahash" xmlns:w16sdtfl="http://schemas.microsoft.com/office/word/2024/wordml/sdtformatlock" xmlns:w16se="http://schemas.microsoft.com/office/word/2015/wordml/symex" xmlns:wpg="http://schemas.microsoft.com/office/word/2010/wordprocessingGroup" xmlns:wpi="http://schemas.microsoft.com/office/word/2010/wordprocessingInk" xmlns:wne="http://schemas.microsoft.com/office/word/2006/wordml" xmlns:wps="http://schemas.microsoft.com/office/word/2010/wordprocessingShape" mc:Ignorable="w14 w15 w16se w16cid w16 w16cex w16sdtdh w16sdtfl w16du wp14">
   <w:body>
-    <w:p/>
+    <w:p>
+      <w:r>
+        <w:rPr>
+          <w:noProof/>
+        </w:rPr>
+        <w:drawing>
+          <wp:inline distT="0" distB="0" distL="0" distR="0" wp14:anchorId="34D85059" wp14:editId="72DC48B4">
+            <wp:extent cx="5943600" cy="2687955"/>
+            <wp:effectExtent l="0" t="0" r="0" b="0"/>
+            <wp:docPr id="1685952350" name="Picture 1"/>
+            <wp:cNvGraphicFramePr>
+              <a:graphicFrameLocks xmlns:a="http://schemas.openxmlformats.org/drawingml/2006/main" noChangeAspect="1"/>
+            </wp:cNvGraphicFramePr>
+            <a:graphic xmlns:a="http://schemas.openxmlformats.org/drawingml/2006/main">
+              <a:graphicData uri="http://schemas.openxmlformats.org/drawingml/2006/picture">
+                <pic:pic xmlns:pic="http://schemas.openxmlformats.org/drawingml/2006/picture">
+                  <pic:nvPicPr>
+                    <pic:cNvPr id="1685952350" name="Picture 1685952350"/>
+                    <pic:cNvPicPr/>
+                  </pic:nvPicPr>
+                  <pic:blipFill>
+                    <a:blip r:embed="rId4" cstate="print">
+                      <a:extLst>
+                        <a:ext uri="{28A0092B-C50C-407E-A947-70E740481C1C}">
+                          <a14:useLocalDpi xmlns:a14="http://schemas.microsoft.com/office/drawing/2010/main" val="0"/>
+                        </a:ext>
+                      </a:extLst>
+                    </a:blip>
+                    <a:stretch>
+                      <a:fillRect/>
+                    </a:stretch>
+                  </pic:blipFill>
+                  <pic:spPr>
+                    <a:xfrm>
+                      <a:off x="0" y="0"/>
+                      <a:ext cx="5943600" cy="2687955"/>
+                    </a:xfrm>
+                    <a:prstGeom prst="rect">
+                      <a:avLst/>
+                    </a:prstGeom>
+                  </pic:spPr>
+                </pic:pic>
+              </a:graphicData>
+            </a:graphic>
+          </wp:inline>
+        </w:drawing>
+      </w:r>
+      <w:r>
+        <w:rPr>
+          <w:noProof/>
+        </w:rPr>
+        <w:drawing>
+          <wp:inline distT="0" distB="0" distL="0" distR="0" wp14:anchorId="63B6462C" wp14:editId="5A3D0B03">
+            <wp:extent cx="5943600" cy="2694305"/>
+            <wp:effectExtent l="0" t="0" r="0" b="0"/>
+            <wp:docPr id="565497759" name="Picture 2"/>
+            <wp:cNvGraphicFramePr>
+              <a:graphicFrameLocks xmlns:a="http://schemas.openxmlformats.org/drawingml/2006/main" noChangeAspect="1"/>
+            </wp:cNvGraphicFramePr>
+            <a:graphic xmlns:a="http://schemas.openxmlformats.org/drawingml/2006/main">
+              <a:graphicData uri="http://schemas.openxmlformats.org/drawingml/2006/picture">
+                <pic:pic xmlns:pic="http://schemas.openxmlformats.org/drawingml/2006/picture">
+                  <pic:nvPicPr>
+                    <pic:cNvPr id="565497759" name="Picture 565497759"/>
+                    <pic:cNvPicPr/>
+                  </pic:nvPicPr>
+                  <pic:blipFill>
+                    <a:blip r:embed="rId5" cstate="print">
+                      <a:extLst>
+                        <a:ext uri="{28A0092B-C50C-407E-A947-70E740481C1C}">
+                          <a14:useLocalDpi xmlns:a14="http://schemas.microsoft.com/office/drawing/2010/main" val="0"/>
+                        </a:ext>
+                      </a:extLst>
+                    </a:blip>
+                    <a:stretch>
+                      <a:fillRect/>
+                    </a:stretch>
+                  </pic:blipFill>
+                  <pic:spPr>
+                    <a:xfrm>
+                      <a:off x="0" y="0"/>
+                      <a:ext cx="5943600" cy="2694305"/>
+                    </a:xfrm>
+                    <a:prstGeom prst="rect">
+                      <a:avLst/>
+                    </a:prstGeom>
+                  </pic:spPr>
+                </pic:pic>
+              </a:graphicData>
+            </a:graphic>
+          </wp:inline>
+        </w:drawing>
+      </w:r>
+      <w:r>
+        <w:rPr>
+          <w:noProof/>
+        </w:rPr>
+        <w:lastRenderedPageBreak/>
+        <w:drawing>
+          <wp:inline distT="0" distB="0" distL="0" distR="0" wp14:anchorId="6D2CB521" wp14:editId="145C4783">
+            <wp:extent cx="5943600" cy="2697480"/>
+            <wp:effectExtent l="0" t="0" r="0" b="7620"/>
+            <wp:docPr id="1342430151" name="Picture 4"/>
+            <wp:cNvGraphicFramePr>
+              <a:graphicFrameLocks xmlns:a="http://schemas.openxmlformats.org/drawingml/2006/main" noChangeAspect="1"/>
+            </wp:cNvGraphicFramePr>
+            <a:graphic xmlns:a="http://schemas.openxmlformats.org/drawingml/2006/main">
+              <a:graphicData uri="http://schemas.openxmlformats.org/drawingml/2006/picture">
+                <pic:pic xmlns:pic="http://schemas.openxmlformats.org/drawingml/2006/picture">
+                  <pic:nvPicPr>
+                    <pic:cNvPr id="1342430151" name="Picture 1342430151"/>
+                    <pic:cNvPicPr/>
+                  </pic:nvPicPr>
+                  <pic:blipFill>
+                    <a:blip r:embed="rId6" cstate="print">
+                      <a:extLst>
+                        <a:ext uri="{28A0092B-C50C-407E-A947-70E740481C1C}">
+                          <a14:useLocalDpi xmlns:a14="http://schemas.microsoft.com/office/drawing/2010/main" val="0"/>
+                        </a:ext>
+                      </a:extLst>
+                    </a:blip>
+                    <a:stretch>
+                      <a:fillRect/>
+                    </a:stretch>
+                  </pic:blipFill>
+                  <pic:spPr>
+                    <a:xfrm>
+                      <a:off x="0" y="0"/>
+                      <a:ext cx="5943600" cy="2697480"/>
+                    </a:xfrm>
+                    <a:prstGeom prst="rect">
+                      <a:avLst/>
+                    </a:prstGeom>
+                  </pic:spPr>
+                </pic:pic>
+              </a:graphicData>
+            </a:graphic>
+          </wp:inline>
+        </w:drawing>
+      </w:r>
+      <w:r>
+        <w:rPr>
+          <w:noProof/>
+        </w:rPr>
+        <w:drawing>
+          <wp:inline distT="0" distB="0" distL="0" distR="0" wp14:anchorId="3AEAA15E" wp14:editId="4C5C84B7">
+            <wp:extent cx="5943600" cy="2691130"/>
+            <wp:effectExtent l="0" t="0" r="0" b="0"/>
+            <wp:docPr id="357772225" name="Picture 5"/>
+            <wp:cNvGraphicFramePr>
+              <a:graphicFrameLocks xmlns:a="http://schemas.openxmlformats.org/drawingml/2006/main" noChangeAspect="1"/>
+            </wp:cNvGraphicFramePr>
+            <a:graphic xmlns:a="http://schemas.openxmlformats.org/drawingml/2006/main">
+              <a:graphicData uri="http://schemas.openxmlformats.org/drawingml/2006/picture">
+                <pic:pic xmlns:pic="http://schemas.openxmlformats.org/drawingml/2006/picture">
+                  <pic:nvPicPr>
+                    <pic:cNvPr id="357772225" name="Picture 357772225"/>
+                    <pic:cNvPicPr/>
+                  </pic:nvPicPr>
+                  <pic:blipFill>
+                    <a:blip r:embed="rId7" cstate="print">
+                      <a:extLst>
+                        <a:ext uri="{28A0092B-C50C-407E-A947-70E740481C1C}">
+                          <a14:useLocalDpi xmlns:a14="http://schemas.microsoft.com/office/drawing/2010/main" val="0"/>
+                        </a:ext>
+                      </a:extLst>
+                    </a:blip>
+                    <a:stretch>
+                      <a:fillRect/>
+                    </a:stretch>
+                  </pic:blipFill>
+                  <pic:spPr>
+                    <a:xfrm>
+                      <a:off x="0" y="0"/>
+                      <a:ext cx="5943600" cy="2691130"/>
+                    </a:xfrm>
+                    <a:prstGeom prst="rect">
+                      <a:avLst/>
+                    </a:prstGeom>
+                  </pic:spPr>
+                </pic:pic>
+              </a:graphicData>
+            </a:graphic>
+          </wp:inline>
+        </w:drawing>
+      </w:r>
+    </w:p>
+    <w:p>
+      <w:r>
+        <w:rPr>
+          <w:noProof/>
+        </w:rPr>
+        <w:lastRenderedPageBreak/>
+        <w:drawing>
+          <wp:inline distT="0" distB="0" distL="0" distR="0" wp14:anchorId="42D8035F" wp14:editId="6C53226C">
+            <wp:extent cx="5943600" cy="2685415"/>
+            <wp:effectExtent l="0" t="0" r="0" b="635"/>
+            <wp:docPr id="1828576601" name="Picture 8"/>
+            <wp:cNvGraphicFramePr>
+              <a:graphicFrameLocks xmlns:a="http://schemas.openxmlformats.org/drawingml/2006/main" noChangeAspect="1"/>
+            </wp:cNvGraphicFramePr>
+            <a:graphic xmlns:a="http://schemas.openxmlformats.org/drawingml/2006/main">
+              <a:graphicData uri="http://schemas.openxmlformats.org/drawingml/2006/picture">
+                <pic:pic xmlns:pic="http://schemas.openxmlformats.org/drawingml/2006/picture">
+                  <pic:nvPicPr>
+                    <pic:cNvPr id="1828576601" name="Picture 1828576601"/>
+                    <pic:cNvPicPr/>
+                  </pic:nvPicPr>
+                  <pic:blipFill>
+                    <a:blip r:embed="rId8" cstate="print">
+                      <a:extLst>
+                        <a:ext uri="{28A0092B-C50C-407E-A947-70E740481C1C}">
+                          <a14:useLocalDpi xmlns:a14="http://schemas.microsoft.com/office/drawing/2010/main" val="0"/>
+                        </a:ext>
+                      </a:extLst>
+                    </a:blip>
+                    <a:stretch>
+                      <a:fillRect/>
+                    </a:stretch>
+                  </pic:blipFill>
+                  <pic:spPr>
+                    <a:xfrm>
+                      <a:off x="0" y="0"/>
+                      <a:ext cx="5943600" cy="2685415"/>
+                    </a:xfrm>
+                    <a:prstGeom prst="rect">
+                      <a:avLst/>
+                    </a:prstGeom>
+                  </pic:spPr>
+                </pic:pic>
+              </a:graphicData>
+            </a:graphic>
+          </wp:inline>
+        </w:drawing>
+      </w:r>
+    </w:p>
     <w:sectPr>
       <w:pgSz w:w="12240" w:h="15840"/>
       <w:pgMar w:top="1440" w:right="1440" w:bottom="1440" w:left="1440" w:header="720" w:footer="720" w:gutter="0"/>

</xml_diff>